<commit_message>
docs: align delivery progress and requirement coverage with verified final code
</commit_message>
<xml_diff>
--- a/docs/交付物/03-开发计划.docx
+++ b/docs/交付物/03-开发计划.docx
@@ -307,7 +307,7 @@
                 <w:i w:val="0"/>
                 <w:sz w:val="17"/>
               </w:rPr>
-              <w:t>小组自主完成；技术栈自选；AI 仅作辅助</w:t>
+              <w:t>小组协作，使用 AI 生成、修改和验证部分代码与文档；个人贡献按实际参与情况核实</w:t>
             </w:r>
           </w:p>
         </w:tc>
@@ -2942,7 +2942,7 @@
                 <w:i w:val="0"/>
                 <w:sz w:val="17"/>
               </w:rPr>
-              <w:t>待完成</w:t>
+              <w:t>已提交测试计划与用例，见 docs/测试与交付/；2026-10-09 更新</w:t>
             </w:r>
           </w:p>
         </w:tc>
@@ -6731,7 +6731,7 @@
           <w:color w:val="000000"/>
           <w:sz w:val="30"/>
         </w:rPr>
-        <w:t>6. 当前进度（截至 2026-10-08）</w:t>
+        <w:t>6. 进度记录（6.1、6.2 为 2026-10-08 快照）</w:t>
       </w:r>
     </w:p>
     <w:p>
@@ -8467,6 +8467,24 @@
       <w:pPr>
         <w:spacing w:after="80"/>
       </w:pPr>
+    </w:p>
+    <w:p>
+      <w:pPr>
+        <w:pStyle w:val="4"/>
+      </w:pPr>
+      <w:r>
+        <w:t>6.3 合并前更新（2026-10-09）</w:t>
+      </w:r>
+    </w:p>
+    <w:p>
+      <w:r>
+        <w:t>成员 5、6 均已提交 PR。成员 6 的测试计划、用例、报告、用户手册、安装记录与验收工具已产出；个人总结、全组总结、封面签名及课程最后一天检查仍由本人和小组完成。</w:t>
+      </w:r>
+    </w:p>
+    <w:p>
+      <w:r>
+        <w:t>集成复核由 AI 执行：独立 MySQL 8.0.42 测试库中，192 项 pytest 全部通过、0 跳过；68 项接口验收全部通过。新增教师目录故障与恢复检查、验收中断/失败退出检查；迁移链新增微秒精度版本，共 6 个版本。证据：docs/测试与交付/验收输出/Windows复测/。压力测试和长期可用性未执行。</w:t>
+      </w:r>
     </w:p>
     <w:p>
       <w:pPr>

</xml_diff>